<commit_message>
Add what-a-phone-can-sense section to SENTINEL gap document
Part D now lists which sources a phone app can actually use to spot a
tail (its own GPS and motion sensors, an OBD-II dongle, an add-on rear
camera) and which it can't (the car's own cameras, radar, blind-spot
sensors and mirrors). It also covers what automatic plate reading will
need and how a hidden tracker can replace a visible tail.

Corrects the claim that a phone can only use one camera at a time; the
real limit is that its cameras face forward and at the driver.

Co-Authored-By: Claude Opus 5.5 <noreply@anthropic.com>
Claude-Session: https://claude.ai/code/session_01N9jr6xXczR6rXM6hZhhatm
</commit_message>
<xml_diff>
--- a/sentinel/docs/SENTINEL_Missing_Parts.docx
+++ b/sentinel/docs/SENTINEL_Missing_Parts.docx
@@ -323,7 +323,7 @@
                 <w:sz w:val="19"/>
                 <w:szCs w:val="19"/>
               </w:rPr>
-              <w:t xml:space="preserve">Why SENTINEL starts on a phone, and how it reaches the car itself</w:t>
+              <w:t xml:space="preserve">Why SENTINEL starts on a phone, what a phone can and can’t sense, and how SENTINEL reaches the car</w:t>
             </w:r>
           </w:p>
         </w:tc>
@@ -15061,7 +15061,7 @@
                 <w:sz w:val="19"/>
                 <w:szCs w:val="19"/>
               </w:rPr>
-              <w:t xml:space="preserve">Not in Phase 1: logging is manual. A phone can run one camera at a time, and reading plates needs machine learning and a development build (Phase 2).</w:t>
+              <w:t xml:space="preserve">Not in Phase 1: logging is manual. The phone’s cameras face forward and at the driver, so seeing behind you needs an add-on rear camera. Reading plates needs machine learning and a development build (see D2).</w:t>
             </w:r>
           </w:p>
         </w:tc>
@@ -16296,11 +16296,12 @@
           <w:sz w:val="28"/>
           <w:szCs w:val="28"/>
         </w:rPr>
-        <w:t xml:space="preserve">D2. Where the phone falls short</w:t>
+        <w:t xml:space="preserve">D2. What the phone can and can’t sense</w:t>
       </w:r>
     </w:p>
     <w:p>
       <w:pPr>
+        <w:keepNext/>
         <w:spacing w:after="100" w:before="80"/>
       </w:pPr>
       <w:r>
@@ -16314,7 +16315,1132 @@
           <w:sz w:val="22"/>
           <w:szCs w:val="22"/>
         </w:rPr>
-        <w:t xml:space="preserve">These are real limits, and they are why the phone is Phase 1 rather than the final product:</w:t>
+        <w:t xml:space="preserve">A phone can’t tap into the car. Car makers keep their cameras and sensors on the car’s own internal network, closed to apps, and mirrors are just glass:</w:t>
+      </w:r>
+    </w:p>
+    <w:tbl>
+      <w:tblPr>
+        <w:tblW w:type="dxa" w:w="9360"/>
+        <w:tblBorders>
+          <w:top w:val="single" w:color="auto" w:sz="4"/>
+          <w:left w:val="single" w:color="auto" w:sz="4"/>
+          <w:bottom w:val="single" w:color="auto" w:sz="4"/>
+          <w:right w:val="single" w:color="auto" w:sz="4"/>
+          <w:insideH w:val="single" w:color="auto" w:sz="4"/>
+          <w:insideV w:val="single" w:color="auto" w:sz="4"/>
+        </w:tblBorders>
+      </w:tblPr>
+      <w:tblGrid>
+        <w:gridCol w:w="2700"/>
+        <w:gridCol w:w="2700"/>
+        <w:gridCol w:w="3960"/>
+      </w:tblGrid>
+      <w:tr>
+        <w:trPr>
+          <w:cantSplit/>
+          <w:tblHeader/>
+        </w:trPr>
+        <w:tc>
+          <w:tcPr>
+            <w:tcW w:type="dxa" w:w="2700"/>
+            <w:tcBorders>
+              <w:top w:val="single" w:color="E2E8F0" w:sz="2"/>
+              <w:left w:val="single" w:color="E2E8F0" w:sz="2"/>
+              <w:bottom w:val="single" w:color="E2E8F0" w:sz="2"/>
+              <w:right w:val="single" w:color="E2E8F0" w:sz="2"/>
+            </w:tcBorders>
+            <w:shd w:fill="0F2A3F" w:color="auto" w:val="clear"/>
+            <w:tcMar>
+              <w:top w:type="dxa" w:w="90"/>
+              <w:left w:type="dxa" w:w="150"/>
+              <w:bottom w:type="dxa" w:w="90"/>
+              <w:right w:type="dxa" w:w="150"/>
+            </w:tcMar>
+          </w:tcPr>
+          <w:p>
+            <w:pPr>
+              <w:keepNext w:val="false"/>
+              <w:spacing w:after="40" w:before="0"/>
+            </w:pPr>
+            <w:r>
+              <w:rPr>
+                <w:rFonts w:ascii="Arial" w:cs="Arial" w:eastAsia="Arial" w:hAnsi="Arial"/>
+                <w:b/>
+                <w:bCs/>
+                <w:color w:val="FFFFFF"/>
+                <w:sz w:val="20"/>
+                <w:szCs w:val="20"/>
+              </w:rPr>
+              <w:t xml:space="preserve">Source</w:t>
+            </w:r>
+          </w:p>
+        </w:tc>
+        <w:tc>
+          <w:tcPr>
+            <w:tcW w:type="dxa" w:w="2700"/>
+            <w:tcBorders>
+              <w:top w:val="single" w:color="E2E8F0" w:sz="2"/>
+              <w:left w:val="single" w:color="E2E8F0" w:sz="2"/>
+              <w:bottom w:val="single" w:color="E2E8F0" w:sz="2"/>
+              <w:right w:val="single" w:color="E2E8F0" w:sz="2"/>
+            </w:tcBorders>
+            <w:shd w:fill="0F2A3F" w:color="auto" w:val="clear"/>
+            <w:tcMar>
+              <w:top w:type="dxa" w:w="90"/>
+              <w:left w:type="dxa" w:w="150"/>
+              <w:bottom w:type="dxa" w:w="90"/>
+              <w:right w:type="dxa" w:w="150"/>
+            </w:tcMar>
+          </w:tcPr>
+          <w:p>
+            <w:pPr>
+              <w:keepNext w:val="false"/>
+              <w:spacing w:after="40" w:before="0"/>
+            </w:pPr>
+            <w:r>
+              <w:rPr>
+                <w:rFonts w:ascii="Arial" w:cs="Arial" w:eastAsia="Arial" w:hAnsi="Arial"/>
+                <w:b/>
+                <w:bCs/>
+                <w:color w:val="FFFFFF"/>
+                <w:sz w:val="20"/>
+                <w:szCs w:val="20"/>
+              </w:rPr>
+              <w:t xml:space="preserve">Can the app use it?</w:t>
+            </w:r>
+          </w:p>
+        </w:tc>
+        <w:tc>
+          <w:tcPr>
+            <w:tcW w:type="dxa" w:w="3960"/>
+            <w:tcBorders>
+              <w:top w:val="single" w:color="E2E8F0" w:sz="2"/>
+              <w:left w:val="single" w:color="E2E8F0" w:sz="2"/>
+              <w:bottom w:val="single" w:color="E2E8F0" w:sz="2"/>
+              <w:right w:val="single" w:color="E2E8F0" w:sz="2"/>
+            </w:tcBorders>
+            <w:shd w:fill="0F2A3F" w:color="auto" w:val="clear"/>
+            <w:tcMar>
+              <w:top w:type="dxa" w:w="90"/>
+              <w:left w:type="dxa" w:w="150"/>
+              <w:bottom w:type="dxa" w:w="90"/>
+              <w:right w:type="dxa" w:w="150"/>
+            </w:tcMar>
+          </w:tcPr>
+          <w:p>
+            <w:pPr>
+              <w:keepNext w:val="false"/>
+              <w:spacing w:after="40" w:before="0"/>
+            </w:pPr>
+            <w:r>
+              <w:rPr>
+                <w:rFonts w:ascii="Arial" w:cs="Arial" w:eastAsia="Arial" w:hAnsi="Arial"/>
+                <w:b/>
+                <w:bCs/>
+                <w:color w:val="FFFFFF"/>
+                <w:sz w:val="20"/>
+                <w:szCs w:val="20"/>
+              </w:rPr>
+              <w:t xml:space="preserve">Does it help spot a tail?</w:t>
+            </w:r>
+          </w:p>
+        </w:tc>
+      </w:tr>
+      <w:tr>
+        <w:trPr>
+          <w:cantSplit/>
+        </w:trPr>
+        <w:tc>
+          <w:tcPr>
+            <w:tcW w:type="dxa" w:w="2700"/>
+            <w:tcBorders>
+              <w:top w:val="single" w:color="E2E8F0" w:sz="2"/>
+              <w:left w:val="single" w:color="E2E8F0" w:sz="2"/>
+              <w:bottom w:val="single" w:color="E2E8F0" w:sz="2"/>
+              <w:right w:val="single" w:color="E2E8F0" w:sz="2"/>
+            </w:tcBorders>
+            <w:shd w:fill="FFFFFF" w:color="auto" w:val="clear"/>
+            <w:tcMar>
+              <w:top w:type="dxa" w:w="90"/>
+              <w:left w:type="dxa" w:w="150"/>
+              <w:bottom w:type="dxa" w:w="90"/>
+              <w:right w:type="dxa" w:w="150"/>
+            </w:tcMar>
+          </w:tcPr>
+          <w:p>
+            <w:pPr>
+              <w:keepNext w:val="false"/>
+              <w:spacing w:after="40" w:before="0"/>
+            </w:pPr>
+            <w:r>
+              <w:rPr>
+                <w:rFonts w:ascii="Arial" w:cs="Arial" w:eastAsia="Arial" w:hAnsi="Arial"/>
+                <w:b w:val="false"/>
+                <w:bCs w:val="false"/>
+                <w:i w:val="false"/>
+                <w:iCs w:val="false"/>
+                <w:color w:val="4A5568"/>
+                <w:sz w:val="19"/>
+                <w:szCs w:val="19"/>
+              </w:rPr>
+              <w:t xml:space="preserve">Phone GPS and motion sensors</w:t>
+            </w:r>
+          </w:p>
+        </w:tc>
+        <w:tc>
+          <w:tcPr>
+            <w:tcW w:type="dxa" w:w="2700"/>
+            <w:tcBorders>
+              <w:top w:val="single" w:color="E2E8F0" w:sz="2"/>
+              <w:left w:val="single" w:color="E2E8F0" w:sz="2"/>
+              <w:bottom w:val="single" w:color="E2E8F0" w:sz="2"/>
+              <w:right w:val="single" w:color="E2E8F0" w:sz="2"/>
+            </w:tcBorders>
+            <w:shd w:fill="FFFFFF" w:color="auto" w:val="clear"/>
+            <w:tcMar>
+              <w:top w:type="dxa" w:w="90"/>
+              <w:left w:type="dxa" w:w="150"/>
+              <w:bottom w:type="dxa" w:w="90"/>
+              <w:right w:type="dxa" w:w="150"/>
+            </w:tcMar>
+          </w:tcPr>
+          <w:p>
+            <w:pPr>
+              <w:keepNext w:val="false"/>
+              <w:spacing w:after="40" w:before="0"/>
+            </w:pPr>
+            <w:r>
+              <w:rPr>
+                <w:rFonts w:ascii="Arial" w:cs="Arial" w:eastAsia="Arial" w:hAnsi="Arial"/>
+                <w:b w:val="false"/>
+                <w:bCs w:val="false"/>
+                <w:i w:val="false"/>
+                <w:iCs w:val="false"/>
+                <w:color w:val="4A5568"/>
+                <w:sz w:val="19"/>
+                <w:szCs w:val="19"/>
+              </w:rPr>
+              <w:t xml:space="preserve">Yes</w:t>
+            </w:r>
+          </w:p>
+        </w:tc>
+        <w:tc>
+          <w:tcPr>
+            <w:tcW w:type="dxa" w:w="3960"/>
+            <w:tcBorders>
+              <w:top w:val="single" w:color="E2E8F0" w:sz="2"/>
+              <w:left w:val="single" w:color="E2E8F0" w:sz="2"/>
+              <w:bottom w:val="single" w:color="E2E8F0" w:sz="2"/>
+              <w:right w:val="single" w:color="E2E8F0" w:sz="2"/>
+            </w:tcBorders>
+            <w:shd w:fill="FFFFFF" w:color="auto" w:val="clear"/>
+            <w:tcMar>
+              <w:top w:type="dxa" w:w="90"/>
+              <w:left w:type="dxa" w:w="150"/>
+              <w:bottom w:type="dxa" w:w="90"/>
+              <w:right w:type="dxa" w:w="150"/>
+            </w:tcMar>
+          </w:tcPr>
+          <w:p>
+            <w:pPr>
+              <w:keepNext w:val="false"/>
+              <w:spacing w:after="40" w:before="0"/>
+            </w:pPr>
+            <w:r>
+              <w:rPr>
+                <w:rFonts w:ascii="Arial" w:cs="Arial" w:eastAsia="Arial" w:hAnsi="Arial"/>
+                <w:b w:val="false"/>
+                <w:bCs w:val="false"/>
+                <w:i w:val="false"/>
+                <w:iCs w:val="false"/>
+                <w:color w:val="4A5568"/>
+                <w:sz w:val="19"/>
+                <w:szCs w:val="19"/>
+              </w:rPr>
+              <w:t xml:space="preserve">Yes: where and when you saw each vehicle, and your turns and speed. The pattern engine runs on this.</w:t>
+            </w:r>
+          </w:p>
+        </w:tc>
+      </w:tr>
+      <w:tr>
+        <w:trPr>
+          <w:cantSplit/>
+        </w:trPr>
+        <w:tc>
+          <w:tcPr>
+            <w:tcW w:type="dxa" w:w="2700"/>
+            <w:tcBorders>
+              <w:top w:val="single" w:color="E2E8F0" w:sz="2"/>
+              <w:left w:val="single" w:color="E2E8F0" w:sz="2"/>
+              <w:bottom w:val="single" w:color="E2E8F0" w:sz="2"/>
+              <w:right w:val="single" w:color="E2E8F0" w:sz="2"/>
+            </w:tcBorders>
+            <w:shd w:fill="F7F8FA" w:color="auto" w:val="clear"/>
+            <w:tcMar>
+              <w:top w:type="dxa" w:w="90"/>
+              <w:left w:type="dxa" w:w="150"/>
+              <w:bottom w:type="dxa" w:w="90"/>
+              <w:right w:type="dxa" w:w="150"/>
+            </w:tcMar>
+          </w:tcPr>
+          <w:p>
+            <w:pPr>
+              <w:keepNext w:val="false"/>
+              <w:spacing w:after="40" w:before="0"/>
+            </w:pPr>
+            <w:r>
+              <w:rPr>
+                <w:rFonts w:ascii="Arial" w:cs="Arial" w:eastAsia="Arial" w:hAnsi="Arial"/>
+                <w:b w:val="false"/>
+                <w:bCs w:val="false"/>
+                <w:i w:val="false"/>
+                <w:iCs w:val="false"/>
+                <w:color w:val="4A5568"/>
+                <w:sz w:val="19"/>
+                <w:szCs w:val="19"/>
+              </w:rPr>
+              <w:t xml:space="preserve">Phone cameras</w:t>
+            </w:r>
+          </w:p>
+        </w:tc>
+        <w:tc>
+          <w:tcPr>
+            <w:tcW w:type="dxa" w:w="2700"/>
+            <w:tcBorders>
+              <w:top w:val="single" w:color="E2E8F0" w:sz="2"/>
+              <w:left w:val="single" w:color="E2E8F0" w:sz="2"/>
+              <w:bottom w:val="single" w:color="E2E8F0" w:sz="2"/>
+              <w:right w:val="single" w:color="E2E8F0" w:sz="2"/>
+            </w:tcBorders>
+            <w:shd w:fill="F7F8FA" w:color="auto" w:val="clear"/>
+            <w:tcMar>
+              <w:top w:type="dxa" w:w="90"/>
+              <w:left w:type="dxa" w:w="150"/>
+              <w:bottom w:type="dxa" w:w="90"/>
+              <w:right w:type="dxa" w:w="150"/>
+            </w:tcMar>
+          </w:tcPr>
+          <w:p>
+            <w:pPr>
+              <w:keepNext w:val="false"/>
+              <w:spacing w:after="40" w:before="0"/>
+            </w:pPr>
+            <w:r>
+              <w:rPr>
+                <w:rFonts w:ascii="Arial" w:cs="Arial" w:eastAsia="Arial" w:hAnsi="Arial"/>
+                <w:b w:val="false"/>
+                <w:bCs w:val="false"/>
+                <w:i w:val="false"/>
+                <w:iCs w:val="false"/>
+                <w:color w:val="4A5568"/>
+                <w:sz w:val="19"/>
+                <w:szCs w:val="19"/>
+              </w:rPr>
+              <w:t xml:space="preserve">Yes</w:t>
+            </w:r>
+          </w:p>
+        </w:tc>
+        <w:tc>
+          <w:tcPr>
+            <w:tcW w:type="dxa" w:w="3960"/>
+            <w:tcBorders>
+              <w:top w:val="single" w:color="E2E8F0" w:sz="2"/>
+              <w:left w:val="single" w:color="E2E8F0" w:sz="2"/>
+              <w:bottom w:val="single" w:color="E2E8F0" w:sz="2"/>
+              <w:right w:val="single" w:color="E2E8F0" w:sz="2"/>
+            </w:tcBorders>
+            <w:shd w:fill="F7F8FA" w:color="auto" w:val="clear"/>
+            <w:tcMar>
+              <w:top w:type="dxa" w:w="90"/>
+              <w:left w:type="dxa" w:w="150"/>
+              <w:bottom w:type="dxa" w:w="90"/>
+              <w:right w:type="dxa" w:w="150"/>
+            </w:tcMar>
+          </w:tcPr>
+          <w:p>
+            <w:pPr>
+              <w:keepNext w:val="false"/>
+              <w:spacing w:after="40" w:before="0"/>
+            </w:pPr>
+            <w:r>
+              <w:rPr>
+                <w:rFonts w:ascii="Arial" w:cs="Arial" w:eastAsia="Arial" w:hAnsi="Arial"/>
+                <w:b w:val="false"/>
+                <w:bCs w:val="false"/>
+                <w:i w:val="false"/>
+                <w:iCs w:val="false"/>
+                <w:color w:val="4A5568"/>
+                <w:sz w:val="19"/>
+                <w:szCs w:val="19"/>
+              </w:rPr>
+              <w:t xml:space="preserve">No. In a dashboard mount they face forward and at the driver, not at the road behind you.</w:t>
+            </w:r>
+          </w:p>
+        </w:tc>
+      </w:tr>
+      <w:tr>
+        <w:trPr>
+          <w:cantSplit/>
+        </w:trPr>
+        <w:tc>
+          <w:tcPr>
+            <w:tcW w:type="dxa" w:w="2700"/>
+            <w:tcBorders>
+              <w:top w:val="single" w:color="E2E8F0" w:sz="2"/>
+              <w:left w:val="single" w:color="E2E8F0" w:sz="2"/>
+              <w:bottom w:val="single" w:color="E2E8F0" w:sz="2"/>
+              <w:right w:val="single" w:color="E2E8F0" w:sz="2"/>
+            </w:tcBorders>
+            <w:shd w:fill="FFFFFF" w:color="auto" w:val="clear"/>
+            <w:tcMar>
+              <w:top w:type="dxa" w:w="90"/>
+              <w:left w:type="dxa" w:w="150"/>
+              <w:bottom w:type="dxa" w:w="90"/>
+              <w:right w:type="dxa" w:w="150"/>
+            </w:tcMar>
+          </w:tcPr>
+          <w:p>
+            <w:pPr>
+              <w:keepNext w:val="false"/>
+              <w:spacing w:after="40" w:before="0"/>
+            </w:pPr>
+            <w:r>
+              <w:rPr>
+                <w:rFonts w:ascii="Arial" w:cs="Arial" w:eastAsia="Arial" w:hAnsi="Arial"/>
+                <w:b w:val="false"/>
+                <w:bCs w:val="false"/>
+                <w:i w:val="false"/>
+                <w:iCs w:val="false"/>
+                <w:color w:val="4A5568"/>
+                <w:sz w:val="19"/>
+                <w:szCs w:val="19"/>
+              </w:rPr>
+              <w:t xml:space="preserve">Car’s reversing and 360° cameras</w:t>
+            </w:r>
+          </w:p>
+        </w:tc>
+        <w:tc>
+          <w:tcPr>
+            <w:tcW w:type="dxa" w:w="2700"/>
+            <w:tcBorders>
+              <w:top w:val="single" w:color="E2E8F0" w:sz="2"/>
+              <w:left w:val="single" w:color="E2E8F0" w:sz="2"/>
+              <w:bottom w:val="single" w:color="E2E8F0" w:sz="2"/>
+              <w:right w:val="single" w:color="E2E8F0" w:sz="2"/>
+            </w:tcBorders>
+            <w:shd w:fill="FFFFFF" w:color="auto" w:val="clear"/>
+            <w:tcMar>
+              <w:top w:type="dxa" w:w="90"/>
+              <w:left w:type="dxa" w:w="150"/>
+              <w:bottom w:type="dxa" w:w="90"/>
+              <w:right w:type="dxa" w:w="150"/>
+            </w:tcMar>
+          </w:tcPr>
+          <w:p>
+            <w:pPr>
+              <w:keepNext w:val="false"/>
+              <w:spacing w:after="40" w:before="0"/>
+            </w:pPr>
+            <w:r>
+              <w:rPr>
+                <w:rFonts w:ascii="Arial" w:cs="Arial" w:eastAsia="Arial" w:hAnsi="Arial"/>
+                <w:b w:val="false"/>
+                <w:bCs w:val="false"/>
+                <w:i w:val="false"/>
+                <w:iCs w:val="false"/>
+                <w:color w:val="4A5568"/>
+                <w:sz w:val="19"/>
+                <w:szCs w:val="19"/>
+              </w:rPr>
+              <w:t xml:space="preserve">No, closed to apps</w:t>
+            </w:r>
+          </w:p>
+        </w:tc>
+        <w:tc>
+          <w:tcPr>
+            <w:tcW w:type="dxa" w:w="3960"/>
+            <w:tcBorders>
+              <w:top w:val="single" w:color="E2E8F0" w:sz="2"/>
+              <w:left w:val="single" w:color="E2E8F0" w:sz="2"/>
+              <w:bottom w:val="single" w:color="E2E8F0" w:sz="2"/>
+              <w:right w:val="single" w:color="E2E8F0" w:sz="2"/>
+            </w:tcBorders>
+            <w:shd w:fill="FFFFFF" w:color="auto" w:val="clear"/>
+            <w:tcMar>
+              <w:top w:type="dxa" w:w="90"/>
+              <w:left w:type="dxa" w:w="150"/>
+              <w:bottom w:type="dxa" w:w="90"/>
+              <w:right w:type="dxa" w:w="150"/>
+            </w:tcMar>
+          </w:tcPr>
+          <w:p>
+            <w:pPr>
+              <w:keepNext w:val="false"/>
+              <w:spacing w:after="40" w:before="0"/>
+            </w:pPr>
+            <w:r>
+              <w:rPr>
+                <w:rFonts w:ascii="Arial" w:cs="Arial" w:eastAsia="Arial" w:hAnsi="Arial"/>
+                <w:b w:val="false"/>
+                <w:bCs w:val="false"/>
+                <w:i w:val="false"/>
+                <w:iCs w:val="false"/>
+                <w:color w:val="4A5568"/>
+                <w:sz w:val="19"/>
+                <w:szCs w:val="19"/>
+              </w:rPr>
+              <w:t xml:space="preserve">They usually only switch on in reverse anyway.</w:t>
+            </w:r>
+          </w:p>
+        </w:tc>
+      </w:tr>
+      <w:tr>
+        <w:trPr>
+          <w:cantSplit/>
+        </w:trPr>
+        <w:tc>
+          <w:tcPr>
+            <w:tcW w:type="dxa" w:w="2700"/>
+            <w:tcBorders>
+              <w:top w:val="single" w:color="E2E8F0" w:sz="2"/>
+              <w:left w:val="single" w:color="E2E8F0" w:sz="2"/>
+              <w:bottom w:val="single" w:color="E2E8F0" w:sz="2"/>
+              <w:right w:val="single" w:color="E2E8F0" w:sz="2"/>
+            </w:tcBorders>
+            <w:shd w:fill="F7F8FA" w:color="auto" w:val="clear"/>
+            <w:tcMar>
+              <w:top w:type="dxa" w:w="90"/>
+              <w:left w:type="dxa" w:w="150"/>
+              <w:bottom w:type="dxa" w:w="90"/>
+              <w:right w:type="dxa" w:w="150"/>
+            </w:tcMar>
+          </w:tcPr>
+          <w:p>
+            <w:pPr>
+              <w:keepNext w:val="false"/>
+              <w:spacing w:after="40" w:before="0"/>
+            </w:pPr>
+            <w:r>
+              <w:rPr>
+                <w:rFonts w:ascii="Arial" w:cs="Arial" w:eastAsia="Arial" w:hAnsi="Arial"/>
+                <w:b w:val="false"/>
+                <w:bCs w:val="false"/>
+                <w:i w:val="false"/>
+                <w:iCs w:val="false"/>
+                <w:color w:val="4A5568"/>
+                <w:sz w:val="19"/>
+                <w:szCs w:val="19"/>
+              </w:rPr>
+              <w:t xml:space="preserve">Car’s radar and blind-spot sensors</w:t>
+            </w:r>
+          </w:p>
+        </w:tc>
+        <w:tc>
+          <w:tcPr>
+            <w:tcW w:type="dxa" w:w="2700"/>
+            <w:tcBorders>
+              <w:top w:val="single" w:color="E2E8F0" w:sz="2"/>
+              <w:left w:val="single" w:color="E2E8F0" w:sz="2"/>
+              <w:bottom w:val="single" w:color="E2E8F0" w:sz="2"/>
+              <w:right w:val="single" w:color="E2E8F0" w:sz="2"/>
+            </w:tcBorders>
+            <w:shd w:fill="F7F8FA" w:color="auto" w:val="clear"/>
+            <w:tcMar>
+              <w:top w:type="dxa" w:w="90"/>
+              <w:left w:type="dxa" w:w="150"/>
+              <w:bottom w:type="dxa" w:w="90"/>
+              <w:right w:type="dxa" w:w="150"/>
+            </w:tcMar>
+          </w:tcPr>
+          <w:p>
+            <w:pPr>
+              <w:keepNext w:val="false"/>
+              <w:spacing w:after="40" w:before="0"/>
+            </w:pPr>
+            <w:r>
+              <w:rPr>
+                <w:rFonts w:ascii="Arial" w:cs="Arial" w:eastAsia="Arial" w:hAnsi="Arial"/>
+                <w:b w:val="false"/>
+                <w:bCs w:val="false"/>
+                <w:i w:val="false"/>
+                <w:iCs w:val="false"/>
+                <w:color w:val="4A5568"/>
+                <w:sz w:val="19"/>
+                <w:szCs w:val="19"/>
+              </w:rPr>
+              <w:t xml:space="preserve">No, closed to apps</w:t>
+            </w:r>
+          </w:p>
+        </w:tc>
+        <w:tc>
+          <w:tcPr>
+            <w:tcW w:type="dxa" w:w="3960"/>
+            <w:tcBorders>
+              <w:top w:val="single" w:color="E2E8F0" w:sz="2"/>
+              <w:left w:val="single" w:color="E2E8F0" w:sz="2"/>
+              <w:bottom w:val="single" w:color="E2E8F0" w:sz="2"/>
+              <w:right w:val="single" w:color="E2E8F0" w:sz="2"/>
+            </w:tcBorders>
+            <w:shd w:fill="F7F8FA" w:color="auto" w:val="clear"/>
+            <w:tcMar>
+              <w:top w:type="dxa" w:w="90"/>
+              <w:left w:type="dxa" w:w="150"/>
+              <w:bottom w:type="dxa" w:w="90"/>
+              <w:right w:type="dxa" w:w="150"/>
+            </w:tcMar>
+          </w:tcPr>
+          <w:p>
+            <w:pPr>
+              <w:keepNext w:val="false"/>
+              <w:spacing w:after="40" w:before="0"/>
+            </w:pPr>
+            <w:r>
+              <w:rPr>
+                <w:rFonts w:ascii="Arial" w:cs="Arial" w:eastAsia="Arial" w:hAnsi="Arial"/>
+                <w:b w:val="false"/>
+                <w:bCs w:val="false"/>
+                <w:i w:val="false"/>
+                <w:iCs w:val="false"/>
+                <w:color w:val="4A5568"/>
+                <w:sz w:val="19"/>
+                <w:szCs w:val="19"/>
+              </w:rPr>
+              <w:t xml:space="preserve">They report that something is there, not which vehicle.</w:t>
+            </w:r>
+          </w:p>
+        </w:tc>
+      </w:tr>
+      <w:tr>
+        <w:trPr>
+          <w:cantSplit/>
+        </w:trPr>
+        <w:tc>
+          <w:tcPr>
+            <w:tcW w:type="dxa" w:w="2700"/>
+            <w:tcBorders>
+              <w:top w:val="single" w:color="E2E8F0" w:sz="2"/>
+              <w:left w:val="single" w:color="E2E8F0" w:sz="2"/>
+              <w:bottom w:val="single" w:color="E2E8F0" w:sz="2"/>
+              <w:right w:val="single" w:color="E2E8F0" w:sz="2"/>
+            </w:tcBorders>
+            <w:shd w:fill="FFFFFF" w:color="auto" w:val="clear"/>
+            <w:tcMar>
+              <w:top w:type="dxa" w:w="90"/>
+              <w:left w:type="dxa" w:w="150"/>
+              <w:bottom w:type="dxa" w:w="90"/>
+              <w:right w:type="dxa" w:w="150"/>
+            </w:tcMar>
+          </w:tcPr>
+          <w:p>
+            <w:pPr>
+              <w:keepNext w:val="false"/>
+              <w:spacing w:after="40" w:before="0"/>
+            </w:pPr>
+            <w:r>
+              <w:rPr>
+                <w:rFonts w:ascii="Arial" w:cs="Arial" w:eastAsia="Arial" w:hAnsi="Arial"/>
+                <w:b w:val="false"/>
+                <w:bCs w:val="false"/>
+                <w:i w:val="false"/>
+                <w:iCs w:val="false"/>
+                <w:color w:val="4A5568"/>
+                <w:sz w:val="19"/>
+                <w:szCs w:val="19"/>
+              </w:rPr>
+              <w:t xml:space="preserve">Mirrors</w:t>
+            </w:r>
+          </w:p>
+        </w:tc>
+        <w:tc>
+          <w:tcPr>
+            <w:tcW w:type="dxa" w:w="2700"/>
+            <w:tcBorders>
+              <w:top w:val="single" w:color="E2E8F0" w:sz="2"/>
+              <w:left w:val="single" w:color="E2E8F0" w:sz="2"/>
+              <w:bottom w:val="single" w:color="E2E8F0" w:sz="2"/>
+              <w:right w:val="single" w:color="E2E8F0" w:sz="2"/>
+            </w:tcBorders>
+            <w:shd w:fill="FFFFFF" w:color="auto" w:val="clear"/>
+            <w:tcMar>
+              <w:top w:type="dxa" w:w="90"/>
+              <w:left w:type="dxa" w:w="150"/>
+              <w:bottom w:type="dxa" w:w="90"/>
+              <w:right w:type="dxa" w:w="150"/>
+            </w:tcMar>
+          </w:tcPr>
+          <w:p>
+            <w:pPr>
+              <w:keepNext w:val="false"/>
+              <w:spacing w:after="40" w:before="0"/>
+            </w:pPr>
+            <w:r>
+              <w:rPr>
+                <w:rFonts w:ascii="Arial" w:cs="Arial" w:eastAsia="Arial" w:hAnsi="Arial"/>
+                <w:b w:val="false"/>
+                <w:bCs w:val="false"/>
+                <w:i w:val="false"/>
+                <w:iCs w:val="false"/>
+                <w:color w:val="4A5568"/>
+                <w:sz w:val="19"/>
+                <w:szCs w:val="19"/>
+              </w:rPr>
+              <w:t xml:space="preserve">No, they are glass</w:t>
+            </w:r>
+          </w:p>
+        </w:tc>
+        <w:tc>
+          <w:tcPr>
+            <w:tcW w:type="dxa" w:w="3960"/>
+            <w:tcBorders>
+              <w:top w:val="single" w:color="E2E8F0" w:sz="2"/>
+              <w:left w:val="single" w:color="E2E8F0" w:sz="2"/>
+              <w:bottom w:val="single" w:color="E2E8F0" w:sz="2"/>
+              <w:right w:val="single" w:color="E2E8F0" w:sz="2"/>
+            </w:tcBorders>
+            <w:shd w:fill="FFFFFF" w:color="auto" w:val="clear"/>
+            <w:tcMar>
+              <w:top w:type="dxa" w:w="90"/>
+              <w:left w:type="dxa" w:w="150"/>
+              <w:bottom w:type="dxa" w:w="90"/>
+              <w:right w:type="dxa" w:w="150"/>
+            </w:tcMar>
+          </w:tcPr>
+          <w:p>
+            <w:pPr>
+              <w:keepNext w:val="false"/>
+              <w:spacing w:after="40" w:before="0"/>
+            </w:pPr>
+            <w:r>
+              <w:rPr>
+                <w:rFonts w:ascii="Arial" w:cs="Arial" w:eastAsia="Arial" w:hAnsi="Arial"/>
+                <w:b w:val="false"/>
+                <w:bCs w:val="false"/>
+                <w:i w:val="false"/>
+                <w:iCs w:val="false"/>
+                <w:color w:val="4A5568"/>
+                <w:sz w:val="19"/>
+                <w:szCs w:val="19"/>
+              </w:rPr>
+              <w:t xml:space="preserve">Only through the driver’s eyes.</w:t>
+            </w:r>
+          </w:p>
+        </w:tc>
+      </w:tr>
+      <w:tr>
+        <w:trPr>
+          <w:cantSplit/>
+        </w:trPr>
+        <w:tc>
+          <w:tcPr>
+            <w:tcW w:type="dxa" w:w="2700"/>
+            <w:tcBorders>
+              <w:top w:val="single" w:color="E2E8F0" w:sz="2"/>
+              <w:left w:val="single" w:color="E2E8F0" w:sz="2"/>
+              <w:bottom w:val="single" w:color="E2E8F0" w:sz="2"/>
+              <w:right w:val="single" w:color="E2E8F0" w:sz="2"/>
+            </w:tcBorders>
+            <w:shd w:fill="F7F8FA" w:color="auto" w:val="clear"/>
+            <w:tcMar>
+              <w:top w:type="dxa" w:w="90"/>
+              <w:left w:type="dxa" w:w="150"/>
+              <w:bottom w:type="dxa" w:w="90"/>
+              <w:right w:type="dxa" w:w="150"/>
+            </w:tcMar>
+          </w:tcPr>
+          <w:p>
+            <w:pPr>
+              <w:keepNext w:val="false"/>
+              <w:spacing w:after="40" w:before="0"/>
+            </w:pPr>
+            <w:r>
+              <w:rPr>
+                <w:rFonts w:ascii="Arial" w:cs="Arial" w:eastAsia="Arial" w:hAnsi="Arial"/>
+                <w:b w:val="false"/>
+                <w:bCs w:val="false"/>
+                <w:i w:val="false"/>
+                <w:iCs w:val="false"/>
+                <w:color w:val="4A5568"/>
+                <w:sz w:val="19"/>
+                <w:szCs w:val="19"/>
+              </w:rPr>
+              <w:t xml:space="preserve">OBD-II port, with a plug-in dongle</w:t>
+            </w:r>
+          </w:p>
+        </w:tc>
+        <w:tc>
+          <w:tcPr>
+            <w:tcW w:type="dxa" w:w="2700"/>
+            <w:tcBorders>
+              <w:top w:val="single" w:color="E2E8F0" w:sz="2"/>
+              <w:left w:val="single" w:color="E2E8F0" w:sz="2"/>
+              <w:bottom w:val="single" w:color="E2E8F0" w:sz="2"/>
+              <w:right w:val="single" w:color="E2E8F0" w:sz="2"/>
+            </w:tcBorders>
+            <w:shd w:fill="F7F8FA" w:color="auto" w:val="clear"/>
+            <w:tcMar>
+              <w:top w:type="dxa" w:w="90"/>
+              <w:left w:type="dxa" w:w="150"/>
+              <w:bottom w:type="dxa" w:w="90"/>
+              <w:right w:type="dxa" w:w="150"/>
+            </w:tcMar>
+          </w:tcPr>
+          <w:p>
+            <w:pPr>
+              <w:keepNext w:val="false"/>
+              <w:spacing w:after="40" w:before="0"/>
+            </w:pPr>
+            <w:r>
+              <w:rPr>
+                <w:rFonts w:ascii="Arial" w:cs="Arial" w:eastAsia="Arial" w:hAnsi="Arial"/>
+                <w:b w:val="false"/>
+                <w:bCs w:val="false"/>
+                <w:i w:val="false"/>
+                <w:iCs w:val="false"/>
+                <w:color w:val="4A5568"/>
+                <w:sz w:val="19"/>
+                <w:szCs w:val="19"/>
+              </w:rPr>
+              <w:t xml:space="preserve">Yes. Choose a Bluetooth LE or Wi-Fi dongle; iPhones can’t use classic Bluetooth ones.</w:t>
+            </w:r>
+          </w:p>
+        </w:tc>
+        <w:tc>
+          <w:tcPr>
+            <w:tcW w:type="dxa" w:w="3960"/>
+            <w:tcBorders>
+              <w:top w:val="single" w:color="E2E8F0" w:sz="2"/>
+              <w:left w:val="single" w:color="E2E8F0" w:sz="2"/>
+              <w:bottom w:val="single" w:color="E2E8F0" w:sz="2"/>
+              <w:right w:val="single" w:color="E2E8F0" w:sz="2"/>
+            </w:tcBorders>
+            <w:shd w:fill="F7F8FA" w:color="auto" w:val="clear"/>
+            <w:tcMar>
+              <w:top w:type="dxa" w:w="90"/>
+              <w:left w:type="dxa" w:w="150"/>
+              <w:bottom w:type="dxa" w:w="90"/>
+              <w:right w:type="dxa" w:w="150"/>
+            </w:tcMar>
+          </w:tcPr>
+          <w:p>
+            <w:pPr>
+              <w:keepNext w:val="false"/>
+              <w:spacing w:after="40" w:before="0"/>
+            </w:pPr>
+            <w:r>
+              <w:rPr>
+                <w:rFonts w:ascii="Arial" w:cs="Arial" w:eastAsia="Arial" w:hAnsi="Arial"/>
+                <w:b w:val="false"/>
+                <w:bCs w:val="false"/>
+                <w:i w:val="false"/>
+                <w:iCs w:val="false"/>
+                <w:color w:val="4A5568"/>
+                <w:sz w:val="19"/>
+                <w:szCs w:val="19"/>
+              </w:rPr>
+              <w:t xml:space="preserve">Indirectly: monitoring can start when the engine starts, and it gives exact speed.</w:t>
+            </w:r>
+          </w:p>
+        </w:tc>
+      </w:tr>
+      <w:tr>
+        <w:trPr>
+          <w:cantSplit/>
+        </w:trPr>
+        <w:tc>
+          <w:tcPr>
+            <w:tcW w:type="dxa" w:w="2700"/>
+            <w:tcBorders>
+              <w:top w:val="single" w:color="E2E8F0" w:sz="2"/>
+              <w:left w:val="single" w:color="E2E8F0" w:sz="2"/>
+              <w:bottom w:val="single" w:color="E2E8F0" w:sz="2"/>
+              <w:right w:val="single" w:color="E2E8F0" w:sz="2"/>
+            </w:tcBorders>
+            <w:shd w:fill="FFFFFF" w:color="auto" w:val="clear"/>
+            <w:tcMar>
+              <w:top w:type="dxa" w:w="90"/>
+              <w:left w:type="dxa" w:w="150"/>
+              <w:bottom w:type="dxa" w:w="90"/>
+              <w:right w:type="dxa" w:w="150"/>
+            </w:tcMar>
+          </w:tcPr>
+          <w:p>
+            <w:pPr>
+              <w:keepNext w:val="false"/>
+              <w:spacing w:after="40" w:before="0"/>
+            </w:pPr>
+            <w:r>
+              <w:rPr>
+                <w:rFonts w:ascii="Arial" w:cs="Arial" w:eastAsia="Arial" w:hAnsi="Arial"/>
+                <w:b w:val="false"/>
+                <w:bCs w:val="false"/>
+                <w:i w:val="false"/>
+                <w:iCs w:val="false"/>
+                <w:color w:val="4A5568"/>
+                <w:sz w:val="19"/>
+                <w:szCs w:val="19"/>
+              </w:rPr>
+              <w:t xml:space="preserve">CarPlay / Android Auto</w:t>
+            </w:r>
+          </w:p>
+        </w:tc>
+        <w:tc>
+          <w:tcPr>
+            <w:tcW w:type="dxa" w:w="2700"/>
+            <w:tcBorders>
+              <w:top w:val="single" w:color="E2E8F0" w:sz="2"/>
+              <w:left w:val="single" w:color="E2E8F0" w:sz="2"/>
+              <w:bottom w:val="single" w:color="E2E8F0" w:sz="2"/>
+              <w:right w:val="single" w:color="E2E8F0" w:sz="2"/>
+            </w:tcBorders>
+            <w:shd w:fill="FFFFFF" w:color="auto" w:val="clear"/>
+            <w:tcMar>
+              <w:top w:type="dxa" w:w="90"/>
+              <w:left w:type="dxa" w:w="150"/>
+              <w:bottom w:type="dxa" w:w="90"/>
+              <w:right w:type="dxa" w:w="150"/>
+            </w:tcMar>
+          </w:tcPr>
+          <w:p>
+            <w:pPr>
+              <w:keepNext w:val="false"/>
+              <w:spacing w:after="40" w:before="0"/>
+            </w:pPr>
+            <w:r>
+              <w:rPr>
+                <w:rFonts w:ascii="Arial" w:cs="Arial" w:eastAsia="Arial" w:hAnsi="Arial"/>
+                <w:b w:val="false"/>
+                <w:bCs w:val="false"/>
+                <w:i w:val="false"/>
+                <w:iCs w:val="false"/>
+                <w:color w:val="4A5568"/>
+                <w:sz w:val="19"/>
+                <w:szCs w:val="19"/>
+              </w:rPr>
+              <w:t xml:space="preserve">The car’s screen and controls only</w:t>
+            </w:r>
+          </w:p>
+        </w:tc>
+        <w:tc>
+          <w:tcPr>
+            <w:tcW w:type="dxa" w:w="3960"/>
+            <w:tcBorders>
+              <w:top w:val="single" w:color="E2E8F0" w:sz="2"/>
+              <w:left w:val="single" w:color="E2E8F0" w:sz="2"/>
+              <w:bottom w:val="single" w:color="E2E8F0" w:sz="2"/>
+              <w:right w:val="single" w:color="E2E8F0" w:sz="2"/>
+            </w:tcBorders>
+            <w:shd w:fill="FFFFFF" w:color="auto" w:val="clear"/>
+            <w:tcMar>
+              <w:top w:type="dxa" w:w="90"/>
+              <w:left w:type="dxa" w:w="150"/>
+              <w:bottom w:type="dxa" w:w="90"/>
+              <w:right w:type="dxa" w:w="150"/>
+            </w:tcMar>
+          </w:tcPr>
+          <w:p>
+            <w:pPr>
+              <w:keepNext w:val="false"/>
+              <w:spacing w:after="40" w:before="0"/>
+            </w:pPr>
+            <w:r>
+              <w:rPr>
+                <w:rFonts w:ascii="Arial" w:cs="Arial" w:eastAsia="Arial" w:hAnsi="Arial"/>
+                <w:b w:val="false"/>
+                <w:bCs w:val="false"/>
+                <w:i w:val="false"/>
+                <w:iCs w:val="false"/>
+                <w:color w:val="4A5568"/>
+                <w:sz w:val="19"/>
+                <w:szCs w:val="19"/>
+              </w:rPr>
+              <w:t xml:space="preserve">No. They don’t share the car’s cameras.</w:t>
+            </w:r>
+          </w:p>
+        </w:tc>
+      </w:tr>
+      <w:tr>
+        <w:trPr>
+          <w:cantSplit/>
+        </w:trPr>
+        <w:tc>
+          <w:tcPr>
+            <w:tcW w:type="dxa" w:w="2700"/>
+            <w:tcBorders>
+              <w:top w:val="single" w:color="E2E8F0" w:sz="2"/>
+              <w:left w:val="single" w:color="E2E8F0" w:sz="2"/>
+              <w:bottom w:val="single" w:color="E2E8F0" w:sz="2"/>
+              <w:right w:val="single" w:color="E2E8F0" w:sz="2"/>
+            </w:tcBorders>
+            <w:shd w:fill="F7F8FA" w:color="auto" w:val="clear"/>
+            <w:tcMar>
+              <w:top w:type="dxa" w:w="90"/>
+              <w:left w:type="dxa" w:w="150"/>
+              <w:bottom w:type="dxa" w:w="90"/>
+              <w:right w:type="dxa" w:w="150"/>
+            </w:tcMar>
+          </w:tcPr>
+          <w:p>
+            <w:pPr>
+              <w:keepNext w:val="false"/>
+              <w:spacing w:after="40" w:before="0"/>
+            </w:pPr>
+            <w:r>
+              <w:rPr>
+                <w:rFonts w:ascii="Arial" w:cs="Arial" w:eastAsia="Arial" w:hAnsi="Arial"/>
+                <w:b w:val="false"/>
+                <w:bCs w:val="false"/>
+                <w:i w:val="false"/>
+                <w:iCs w:val="false"/>
+                <w:color w:val="4A5568"/>
+                <w:sz w:val="19"/>
+                <w:szCs w:val="19"/>
+              </w:rPr>
+              <w:t xml:space="preserve">Add-on rear camera</w:t>
+            </w:r>
+          </w:p>
+        </w:tc>
+        <w:tc>
+          <w:tcPr>
+            <w:tcW w:type="dxa" w:w="2700"/>
+            <w:tcBorders>
+              <w:top w:val="single" w:color="E2E8F0" w:sz="2"/>
+              <w:left w:val="single" w:color="E2E8F0" w:sz="2"/>
+              <w:bottom w:val="single" w:color="E2E8F0" w:sz="2"/>
+              <w:right w:val="single" w:color="E2E8F0" w:sz="2"/>
+            </w:tcBorders>
+            <w:shd w:fill="F7F8FA" w:color="auto" w:val="clear"/>
+            <w:tcMar>
+              <w:top w:type="dxa" w:w="90"/>
+              <w:left w:type="dxa" w:w="150"/>
+              <w:bottom w:type="dxa" w:w="90"/>
+              <w:right w:type="dxa" w:w="150"/>
+            </w:tcMar>
+          </w:tcPr>
+          <w:p>
+            <w:pPr>
+              <w:keepNext w:val="false"/>
+              <w:spacing w:after="40" w:before="0"/>
+            </w:pPr>
+            <w:r>
+              <w:rPr>
+                <w:rFonts w:ascii="Arial" w:cs="Arial" w:eastAsia="Arial" w:hAnsi="Arial"/>
+                <w:b w:val="false"/>
+                <w:bCs w:val="false"/>
+                <w:i w:val="false"/>
+                <w:iCs w:val="false"/>
+                <w:color w:val="4A5568"/>
+                <w:sz w:val="19"/>
+                <w:szCs w:val="19"/>
+              </w:rPr>
+              <w:t xml:space="preserve">Yes, over Wi-Fi or a cable</w:t>
+            </w:r>
+          </w:p>
+        </w:tc>
+        <w:tc>
+          <w:tcPr>
+            <w:tcW w:type="dxa" w:w="3960"/>
+            <w:tcBorders>
+              <w:top w:val="single" w:color="E2E8F0" w:sz="2"/>
+              <w:left w:val="single" w:color="E2E8F0" w:sz="2"/>
+              <w:bottom w:val="single" w:color="E2E8F0" w:sz="2"/>
+              <w:right w:val="single" w:color="E2E8F0" w:sz="2"/>
+            </w:tcBorders>
+            <w:shd w:fill="F7F8FA" w:color="auto" w:val="clear"/>
+            <w:tcMar>
+              <w:top w:type="dxa" w:w="90"/>
+              <w:left w:type="dxa" w:w="150"/>
+              <w:bottom w:type="dxa" w:w="90"/>
+              <w:right w:type="dxa" w:w="150"/>
+            </w:tcMar>
+          </w:tcPr>
+          <w:p>
+            <w:pPr>
+              <w:keepNext w:val="false"/>
+              <w:spacing w:after="40" w:before="0"/>
+            </w:pPr>
+            <w:r>
+              <w:rPr>
+                <w:rFonts w:ascii="Arial" w:cs="Arial" w:eastAsia="Arial" w:hAnsi="Arial"/>
+                <w:b w:val="false"/>
+                <w:bCs w:val="false"/>
+                <w:i w:val="false"/>
+                <w:iCs w:val="false"/>
+                <w:color w:val="4A5568"/>
+                <w:sz w:val="19"/>
+                <w:szCs w:val="19"/>
+              </w:rPr>
+              <w:t xml:space="preserve">Yes. The only practical way to see behind you.</w:t>
+            </w:r>
+          </w:p>
+        </w:tc>
+      </w:tr>
+    </w:tbl>
+    <w:p>
+      <w:pPr>
+        <w:spacing w:after="0" w:before="120"/>
+      </w:pPr>
+    </w:p>
+    <w:p>
+      <w:pPr>
+        <w:spacing w:after="100" w:before="80"/>
+      </w:pPr>
+      <w:r>
+        <w:rPr>
+          <w:rFonts w:ascii="Arial" w:cs="Arial" w:eastAsia="Arial" w:hAnsi="Arial"/>
+          <w:b/>
+          <w:bCs/>
+          <w:i w:val="false"/>
+          <w:iCs w:val="false"/>
+          <w:color w:val="0D0D0D"/>
+          <w:sz w:val="22"/>
+          <w:szCs w:val="22"/>
+        </w:rPr>
+        <w:t xml:space="preserve">So in Phase 1 the driver is the sensor:</w:t>
+      </w:r>
+      <w:r>
+        <w:rPr>
+          <w:rFonts w:ascii="Arial" w:cs="Arial" w:eastAsia="Arial" w:hAnsi="Arial"/>
+          <w:b w:val="false"/>
+          <w:bCs w:val="false"/>
+          <w:i w:val="false"/>
+          <w:iCs w:val="false"/>
+          <w:color w:val="4A5568"/>
+          <w:sz w:val="22"/>
+          <w:szCs w:val="22"/>
+        </w:rPr>
+        <w:t xml:space="preserve"> you notice a vehicle in the mirror and log it. The app does what people are bad at: remembering every vehicle, measuring time and distance, scoring the pattern and running the SDR. That is useful, but it is only as fast as the driver is observant.</w:t>
+      </w:r>
+    </w:p>
+    <w:p>
+      <w:pPr>
+        <w:keepNext/>
+        <w:spacing w:after="100" w:before="80"/>
+      </w:pPr>
+      <w:r>
+        <w:rPr>
+          <w:rFonts w:ascii="Arial" w:cs="Arial" w:eastAsia="Arial" w:hAnsi="Arial"/>
+          <w:b/>
+          <w:bCs/>
+          <w:i w:val="false"/>
+          <w:iCs w:val="false"/>
+          <w:color w:val="0D0D0D"/>
+          <w:sz w:val="22"/>
+          <w:szCs w:val="22"/>
+        </w:rPr>
+        <w:t xml:space="preserve">Spotting a tail fast needs eyes behind the car:</w:t>
+      </w:r>
+      <w:r>
+        <w:rPr>
+          <w:rFonts w:ascii="Arial" w:cs="Arial" w:eastAsia="Arial" w:hAnsi="Arial"/>
+          <w:b w:val="false"/>
+          <w:bCs w:val="false"/>
+          <w:i w:val="false"/>
+          <w:iCs w:val="false"/>
+          <w:color w:val="4A5568"/>
+          <w:sz w:val="22"/>
+          <w:szCs w:val="22"/>
+        </w:rPr>
+        <w:t xml:space="preserve"> a camera in the rear window and automatic plate reading (ANPR) on the phone, logging every plate behind you every second or two. The pattern engine then flags a follower within a few zones, which is minutes of driving rather than waiting for the driver to notice. Plan for three things:</w:t>
       </w:r>
     </w:p>
     <w:p>
@@ -16337,7 +17463,7 @@
           <w:sz w:val="22"/>
           <w:szCs w:val="22"/>
         </w:rPr>
-        <w:t xml:space="preserve">Wrong camera direction.</w:t>
+        <w:t xml:space="preserve">The engine must count encounters, not camera frames.</w:t>
       </w:r>
       <w:r>
         <w:rPr>
@@ -16350,7 +17476,7 @@
           <w:sz w:val="22"/>
           <w:szCs w:val="22"/>
         </w:rPr>
-        <w:t xml:space="preserve"> A follower is behind you, but a phone in a windscreen mount faces forward and uses one camera at a time. The right sensor is a rear dashcam.</w:t>
+        <w:t xml:space="preserve"> A car sitting behind you for a minute is one encounter, not 60 sightings. Today’s engine assumes a person logged each sighting on purpose.</w:t>
       </w:r>
     </w:p>
     <w:p>
@@ -16373,7 +17499,7 @@
           <w:sz w:val="22"/>
           <w:szCs w:val="22"/>
         </w:rPr>
-        <w:t xml:space="preserve">Heat and battery.</w:t>
+        <w:t xml:space="preserve">Night is hard.</w:t>
       </w:r>
       <w:r>
         <w:rPr>
@@ -16386,7 +17512,7 @@
           <w:sz w:val="22"/>
           <w:szCs w:val="22"/>
         </w:rPr>
-        <w:t xml:space="preserve"> GPS and screen running for hours on a sunny dashboard drain and overheat phones.</w:t>
+        <w:t xml:space="preserve"> The follower’s headlights glare over its plate, so you need a camera built for night plate reading (infrared).</w:t>
       </w:r>
     </w:p>
     <w:p>
@@ -16409,7 +17535,7 @@
           <w:sz w:val="22"/>
           <w:szCs w:val="22"/>
         </w:rPr>
-        <w:t xml:space="preserve">It has to be started.</w:t>
+        <w:t xml:space="preserve">Plates can count as personal data.</w:t>
       </w:r>
       <w:r>
         <w:rPr>
@@ -16422,7 +17548,26 @@
           <w:sz w:val="22"/>
           <w:szCs w:val="22"/>
         </w:rPr>
-        <w:t xml:space="preserve"> A car system switches on with the ignition. A phone app has to be remembered.</w:t>
+        <w:t xml:space="preserve"> Keep plate reads on the phone and delete them automatically, as the kit already does after 24 hours, to stay within Nigeria’s Data Protection Act 2023.</w:t>
+      </w:r>
+    </w:p>
+    <w:p>
+      <w:pPr>
+        <w:keepNext/>
+        <w:spacing w:after="100" w:before="80"/>
+      </w:pPr>
+      <w:r>
+        <w:rPr>
+          <w:rFonts w:ascii="Arial" w:cs="Arial" w:eastAsia="Arial" w:hAnsi="Arial"/>
+          <w:b w:val="false"/>
+          <w:bCs w:val="false"/>
+          <w:i w:val="false"/>
+          <w:iCs w:val="false"/>
+          <w:color w:val="4A5568"/>
+          <w:sz w:val="22"/>
+          <w:szCs w:val="22"/>
+        </w:rPr>
+        <w:t xml:space="preserve">The phone’s other limits:</w:t>
       </w:r>
     </w:p>
     <w:p>
@@ -16445,7 +17590,7 @@
           <w:sz w:val="22"/>
           <w:szCs w:val="22"/>
         </w:rPr>
-        <w:t xml:space="preserve">It is the first thing attackers take.</w:t>
+        <w:t xml:space="preserve">Heat and battery.</w:t>
       </w:r>
       <w:r>
         <w:rPr>
@@ -16458,7 +17603,115 @@
           <w:sz w:val="22"/>
           <w:szCs w:val="22"/>
         </w:rPr>
+        <w:t xml:space="preserve"> GPS and screen running for hours on a sunny dashboard drain and overheat phones.</w:t>
+      </w:r>
+    </w:p>
+    <w:p>
+      <w:pPr>
+        <w:pStyle w:val="ListParagraph"/>
+        <w:numPr>
+          <w:ilvl w:val="0"/>
+          <w:numId w:val="2"/>
+        </w:numPr>
+        <w:spacing w:after="60" w:before="40"/>
+      </w:pPr>
+      <w:r>
+        <w:rPr>
+          <w:rFonts w:ascii="Arial" w:cs="Arial" w:eastAsia="Arial" w:hAnsi="Arial"/>
+          <w:b/>
+          <w:bCs/>
+          <w:i w:val="false"/>
+          <w:iCs w:val="false"/>
+          <w:color w:val="0D0D0D"/>
+          <w:sz w:val="22"/>
+          <w:szCs w:val="22"/>
+        </w:rPr>
+        <w:t xml:space="preserve">It has to be started.</w:t>
+      </w:r>
+      <w:r>
+        <w:rPr>
+          <w:rFonts w:ascii="Arial" w:cs="Arial" w:eastAsia="Arial" w:hAnsi="Arial"/>
+          <w:b w:val="false"/>
+          <w:bCs w:val="false"/>
+          <w:i w:val="false"/>
+          <w:iCs w:val="false"/>
+          <w:color w:val="4A5568"/>
+          <w:sz w:val="22"/>
+          <w:szCs w:val="22"/>
+        </w:rPr>
+        <w:t xml:space="preserve"> A car system switches on with the ignition. A phone app has to be remembered.</w:t>
+      </w:r>
+    </w:p>
+    <w:p>
+      <w:pPr>
+        <w:pStyle w:val="ListParagraph"/>
+        <w:numPr>
+          <w:ilvl w:val="0"/>
+          <w:numId w:val="2"/>
+        </w:numPr>
+        <w:spacing w:after="60" w:before="40"/>
+      </w:pPr>
+      <w:r>
+        <w:rPr>
+          <w:rFonts w:ascii="Arial" w:cs="Arial" w:eastAsia="Arial" w:hAnsi="Arial"/>
+          <w:b/>
+          <w:bCs/>
+          <w:i w:val="false"/>
+          <w:iCs w:val="false"/>
+          <w:color w:val="0D0D0D"/>
+          <w:sz w:val="22"/>
+          <w:szCs w:val="22"/>
+        </w:rPr>
+        <w:t xml:space="preserve">It is the first thing attackers take.</w:t>
+      </w:r>
+      <w:r>
+        <w:rPr>
+          <w:rFonts w:ascii="Arial" w:cs="Arial" w:eastAsia="Arial" w:hAnsi="Arial"/>
+          <w:b w:val="false"/>
+          <w:bCs w:val="false"/>
+          <w:i w:val="false"/>
+          <w:iCs w:val="false"/>
+          <w:color w:val="4A5568"/>
+          <w:sz w:val="22"/>
+          <w:szCs w:val="22"/>
+        </w:rPr>
         <w:t xml:space="preserve"> Anything that must keep working after a phone is seized has to live in the car or on a server.</w:t>
+      </w:r>
+    </w:p>
+    <w:p>
+      <w:pPr>
+        <w:pStyle w:val="ListParagraph"/>
+        <w:numPr>
+          <w:ilvl w:val="0"/>
+          <w:numId w:val="2"/>
+        </w:numPr>
+        <w:spacing w:after="60" w:before="40"/>
+      </w:pPr>
+      <w:r>
+        <w:rPr>
+          <w:rFonts w:ascii="Arial" w:cs="Arial" w:eastAsia="Arial" w:hAnsi="Arial"/>
+          <w:b/>
+          <w:bCs/>
+          <w:i w:val="false"/>
+          <w:iCs w:val="false"/>
+          <w:color w:val="0D0D0D"/>
+          <w:sz w:val="22"/>
+          <w:szCs w:val="22"/>
+        </w:rPr>
+        <w:t xml:space="preserve">Some tails can’t be seen at all.</w:t>
+      </w:r>
+      <w:r>
+        <w:rPr>
+          <w:rFonts w:ascii="Arial" w:cs="Arial" w:eastAsia="Arial" w:hAnsi="Arial"/>
+          <w:b w:val="false"/>
+          <w:bCs w:val="false"/>
+          <w:i w:val="false"/>
+          <w:iCs w:val="false"/>
+          <w:color w:val="4A5568"/>
+          <w:sz w:val="22"/>
+          <w:szCs w:val="22"/>
+        </w:rPr>
+        <w:t xml:space="preserve"> A surveillance team can hide a GPS tracker on your car and never follow closely. Most of these trackers use a SIM card and no Bluetooth, so no phone app can find them; that takes a physical inspection or an electronic sweep. Phones already warn you about AirTag-style Bluetooth trackers.</w:t>
       </w:r>
     </w:p>
     <w:p>
@@ -17193,7 +18446,7 @@
                 <w:sz w:val="19"/>
                 <w:szCs w:val="19"/>
               </w:rPr>
-              <w:t xml:space="preserve">A Wi-Fi rear dashcam and a Bluetooth OBD-II dongle connected to the app</w:t>
+              <w:t xml:space="preserve">An add-on rear camera (for example a dashcam’s rear unit) and an OBD-II dongle, connected to the app</w:t>
             </w:r>
           </w:p>
         </w:tc>
@@ -17230,7 +18483,7 @@
                 <w:sz w:val="19"/>
                 <w:szCs w:val="19"/>
               </w:rPr>
-              <w:t xml:space="preserve">Real REAR CAM footage for plate reading. Monitoring starts when the engine starts.</w:t>
+              <w:t xml:space="preserve">Automatic plate reading of every vehicle behind you. Monitoring starts when the engine starts.</w:t>
             </w:r>
           </w:p>
         </w:tc>
@@ -17267,7 +18520,7 @@
                 <w:sz w:val="19"/>
                 <w:szCs w:val="19"/>
               </w:rPr>
-              <w:t xml:space="preserve">The hardware bundle already in your business model</w:t>
+              <w:t xml:space="preserve">The hardware bundle already in your business model, plus plate-reading software and a development build</w:t>
             </w:r>
           </w:p>
         </w:tc>
@@ -17451,7 +18704,7 @@
           <w:sz w:val="22"/>
           <w:szCs w:val="22"/>
         </w:rPr>
-        <w:t xml:space="preserve">Keep the plan as it is: finish Phase 1 on the phone, prove the pattern engine and the SDR with real drivers, then add the car in the order above. Everything in the code kit (engine, SDR, database) carries over unchanged to Android Auto, car stereos and a server.</w:t>
+        <w:t xml:space="preserve">Keep the plan as it is: finish Phase 1 on the phone, prove the pattern engine and the SDR with real drivers, then add the car in the order above. The code kit carries over to Android Auto, car stereos and a server. Automatic plate reading needs one engine change: counting encounters instead of camera frames.</w:t>
       </w:r>
     </w:p>
     <w:sectPr>

</xml_diff>

<commit_message>
Explain distance tails in SENTINEL gap document
A professional tail stays several cars back, where traffic hides it and
its plate is too small for a wide-angle rear camera to read. Section D2
no longer implies a rear camera will catch every follower: it says the
camera mostly catches close followers, and that the SDR maneuvers expose
a distant tail by stripping away the cars in between.

Co-Authored-By: Claude Opus 5.5 <noreply@anthropic.com>
Claude-Session: https://claude.ai/code/session_01N9jr6xXczR6rXM6hZhhatm
</commit_message>
<xml_diff>
--- a/sentinel/docs/SENTINEL_Missing_Parts.docx
+++ b/sentinel/docs/SENTINEL_Missing_Parts.docx
@@ -17427,7 +17427,7 @@
           <w:sz w:val="22"/>
           <w:szCs w:val="22"/>
         </w:rPr>
-        <w:t xml:space="preserve">Spotting a tail fast needs eyes behind the car:</w:t>
+        <w:t xml:space="preserve">Spotting a tail sooner needs eyes behind the car:</w:t>
       </w:r>
       <w:r>
         <w:rPr>
@@ -17440,7 +17440,43 @@
           <w:sz w:val="22"/>
           <w:szCs w:val="22"/>
         </w:rPr>
-        <w:t xml:space="preserve"> a camera in the rear window and automatic plate reading (ANPR) on the phone, logging every plate behind you every second or two. The pattern engine then flags a follower within a few zones, which is minutes of driving rather than waiting for the driver to notice. Plan for three things:</w:t>
+        <w:t xml:space="preserve"> a camera in the rear window and automatic plate reading (ANPR) on the phone, logging every plate it can read every second or two. The pattern engine then flags a follower whose plate it keeps reading within a few zones, rather than waiting for the driver to notice. Plan for four things:</w:t>
+      </w:r>
+    </w:p>
+    <w:p>
+      <w:pPr>
+        <w:pStyle w:val="ListParagraph"/>
+        <w:numPr>
+          <w:ilvl w:val="0"/>
+          <w:numId w:val="2"/>
+        </w:numPr>
+        <w:spacing w:after="60" w:before="40"/>
+      </w:pPr>
+      <w:r>
+        <w:rPr>
+          <w:rFonts w:ascii="Arial" w:cs="Arial" w:eastAsia="Arial" w:hAnsi="Arial"/>
+          <w:b/>
+          <w:bCs/>
+          <w:i w:val="false"/>
+          <w:iCs w:val="false"/>
+          <w:color w:val="0D0D0D"/>
+          <w:sz w:val="22"/>
+          <w:szCs w:val="22"/>
+        </w:rPr>
+        <w:t xml:space="preserve">A careful tail keeps its distance.</w:t>
+      </w:r>
+      <w:r>
+        <w:rPr>
+          <w:rFonts w:ascii="Arial" w:cs="Arial" w:eastAsia="Arial" w:hAnsi="Arial"/>
+          <w:b w:val="false"/>
+          <w:bCs w:val="false"/>
+          <w:i w:val="false"/>
+          <w:iCs w:val="false"/>
+          <w:color w:val="4A5568"/>
+          <w:sz w:val="22"/>
+          <w:szCs w:val="22"/>
+        </w:rPr>
+        <w:t xml:space="preserve"> A professional stays several cars back, where the cars in between hide it and its plate is too small to read. A typical wide-angle dashcam reads plates only about one car length away, and even a zoom lens needs a clear view, so the camera mostly catches close or careless followers. The SDR is what exposes a distant tail: after a box turn or roundabout loop the cars in between don’t follow, so the tail must close up behind you or lose you. During a speed check it must overtake you, passing the phone’s forward camera, or end up directly behind you.</w:t>
       </w:r>
     </w:p>
     <w:p>

</xml_diff>